<commit_message>
docs(courseware): build page-numbered TOC for LP/LG, bump LP v3.1 & LG v6.1
- Add a page-numbered Table of Contents to the LP and LG PDFs (courseware/build/
  inject_toc.py computes entry page numbers from the rendered PDF, since headless
  LibreOffice can't update the TOC field here); add build_courseware.sh pipeline
- LP → v3.1, LG → v6.1 (document version-control rows dated 1 July 2026)
- Confirm LP footer page numbers + daily-schedule table borders
- Full alignment pass: activities, n8n workflows, PPT, LP, LG, LEARNER-GUIDE.md
- Regenerate PPT/LP/LG DOCX + PDF

Co-Authored-By: Claude Opus 4.8 (1M context) <noreply@anthropic.com>
</commit_message>
<xml_diff>
--- a/courseware/LG-Agentic AI Automation with n8n.docx
+++ b/courseware/LG-Agentic AI Automation with n8n.docx
@@ -218,7 +218,7 @@
           <w:color w:val="1F6FEB"/>
           <w:sz w:val="24"/>
         </w:rPr>
-        <w:t>Version 6.0</w:t>
+        <w:t>Version 6.1</w:t>
       </w:r>
     </w:p>
     <w:p>
@@ -670,6 +670,64 @@
           </w:p>
         </w:tc>
       </w:tr>
+      <w:tr>
+        <w:tc>
+          <w:tcPr>
+            <w:tcW w:type="dxa" w:w="2160"/>
+          </w:tcPr>
+          <w:p>
+            <w:r/>
+            <w:r>
+              <w:rPr>
+                <w:sz w:val="19"/>
+              </w:rPr>
+              <w:t>6.1</w:t>
+            </w:r>
+          </w:p>
+        </w:tc>
+        <w:tc>
+          <w:tcPr>
+            <w:tcW w:type="dxa" w:w="2160"/>
+          </w:tcPr>
+          <w:p>
+            <w:r/>
+            <w:r>
+              <w:rPr>
+                <w:sz w:val="19"/>
+              </w:rPr>
+              <w:t>1 July 2026</w:t>
+            </w:r>
+          </w:p>
+        </w:tc>
+        <w:tc>
+          <w:tcPr>
+            <w:tcW w:type="dxa" w:w="2160"/>
+          </w:tcPr>
+          <w:p>
+            <w:r/>
+            <w:r>
+              <w:rPr>
+                <w:sz w:val="19"/>
+              </w:rPr>
+              <w:t>Added a page-numbered Table of Contents; embedded real n8n flow screenshots and activity website screenshots for every activity (5, 6, 7a, 7b, 8, capstone); expanded step-by-step detail; aligned the Learner Guide (DOCX + Markdown) with the slides, Lesson Plan and lab workflows</w:t>
+            </w:r>
+          </w:p>
+        </w:tc>
+        <w:tc>
+          <w:tcPr>
+            <w:tcW w:type="dxa" w:w="2160"/>
+          </w:tcPr>
+          <w:p>
+            <w:r/>
+            <w:r>
+              <w:rPr>
+                <w:sz w:val="19"/>
+              </w:rPr>
+              <w:t>Tertiary Infotech Academy Pte Ltd</w:t>
+            </w:r>
+          </w:p>
+        </w:tc>
+      </w:tr>
     </w:tbl>
     <w:p>
       <w:r>
@@ -690,12 +748,473 @@
       </w:r>
     </w:p>
     <w:p>
-      <w:r>
-        <w:fldChar w:fldCharType="begin"/>
-        <w:instrText xml:space="preserve">TOC \o "1-2" \h \z \u</w:instrText>
-        <w:fldChar w:fldCharType="separate"/>
-        <w:t>Right-click and choose “Update Field”, or press F9, to build the table of contents.</w:t>
-        <w:fldChar w:fldCharType="end"/>
+      <w:pPr>
+        <w:tabs>
+          <w:tab w:pos="9072" w:val="right" w:leader="dot"/>
+        </w:tabs>
+        <w:spacing w:after="60"/>
+      </w:pPr>
+      <w:r>
+        <w:rPr>
+          <w:rFonts w:ascii="Arial" w:hAnsi="Arial"/>
+          <w:b/>
+          <w:color w:val="333333"/>
+          <w:sz w:val="22"/>
+        </w:rPr>
+        <w:t>0. Before You Start — Setup &amp; Prerequisites</w:t>
+        <w:tab/>
+        <w:t>5</w:t>
+      </w:r>
+    </w:p>
+    <w:p>
+      <w:pPr>
+        <w:tabs>
+          <w:tab w:pos="9072" w:val="right" w:leader="dot"/>
+        </w:tabs>
+        <w:spacing w:after="60"/>
+      </w:pPr>
+      <w:r>
+        <w:rPr>
+          <w:rFonts w:ascii="Arial" w:hAnsi="Arial"/>
+          <w:b/>
+          <w:color w:val="333333"/>
+          <w:sz w:val="22"/>
+        </w:rPr>
+        <w:t>Topic 1: Workflow Automation with n8n</w:t>
+        <w:tab/>
+        <w:t>7</w:t>
+      </w:r>
+    </w:p>
+    <w:p>
+      <w:pPr>
+        <w:tabs>
+          <w:tab w:pos="9072" w:val="right" w:leader="dot"/>
+        </w:tabs>
+        <w:spacing w:after="60"/>
+        <w:ind w:left="432"/>
+      </w:pPr>
+      <w:r>
+        <w:rPr>
+          <w:rFonts w:ascii="Arial" w:hAnsi="Arial"/>
+          <w:b w:val="0"/>
+          <w:color w:val="333333"/>
+          <w:sz w:val="21"/>
+        </w:rPr>
+        <w:t>Activity 1 — Flyer with QR Code (Form → Email)</w:t>
+        <w:tab/>
+        <w:t>7</w:t>
+      </w:r>
+    </w:p>
+    <w:p>
+      <w:pPr>
+        <w:tabs>
+          <w:tab w:pos="9072" w:val="right" w:leader="dot"/>
+        </w:tabs>
+        <w:spacing w:after="60"/>
+        <w:ind w:left="432"/>
+      </w:pPr>
+      <w:r>
+        <w:rPr>
+          <w:rFonts w:ascii="Arial" w:hAnsi="Arial"/>
+          <w:b w:val="0"/>
+          <w:color w:val="333333"/>
+          <w:sz w:val="21"/>
+        </w:rPr>
+        <w:t>Activity 2 — Capture Submissions in a Data Table</w:t>
+        <w:tab/>
+        <w:t>8</w:t>
+      </w:r>
+    </w:p>
+    <w:p>
+      <w:pPr>
+        <w:tabs>
+          <w:tab w:pos="9072" w:val="right" w:leader="dot"/>
+        </w:tabs>
+        <w:spacing w:after="60"/>
+        <w:ind w:left="432"/>
+      </w:pPr>
+      <w:r>
+        <w:rPr>
+          <w:rFonts w:ascii="Arial" w:hAnsi="Arial"/>
+          <w:b w:val="0"/>
+          <w:color w:val="333333"/>
+          <w:sz w:val="21"/>
+        </w:rPr>
+        <w:t>Activity 3a — Conditional Response (Data Table)</w:t>
+        <w:tab/>
+        <w:t>9</w:t>
+      </w:r>
+    </w:p>
+    <w:p>
+      <w:pPr>
+        <w:tabs>
+          <w:tab w:pos="9072" w:val="right" w:leader="dot"/>
+        </w:tabs>
+        <w:spacing w:after="60"/>
+        <w:ind w:left="432"/>
+      </w:pPr>
+      <w:r>
+        <w:rPr>
+          <w:rFonts w:ascii="Arial" w:hAnsi="Arial"/>
+          <w:b w:val="0"/>
+          <w:color w:val="333333"/>
+          <w:sz w:val="21"/>
+        </w:rPr>
+        <w:t>Activity 3b — Conditional Response (Google Sheets / Excel)</w:t>
+        <w:tab/>
+        <w:t>10</w:t>
+      </w:r>
+    </w:p>
+    <w:p>
+      <w:pPr>
+        <w:tabs>
+          <w:tab w:pos="9072" w:val="right" w:leader="dot"/>
+        </w:tabs>
+        <w:spacing w:after="60"/>
+      </w:pPr>
+      <w:r>
+        <w:rPr>
+          <w:rFonts w:ascii="Arial" w:hAnsi="Arial"/>
+          <w:b/>
+          <w:color w:val="333333"/>
+          <w:sz w:val="22"/>
+        </w:rPr>
+        <w:t>Topic 2: AI Agents</w:t>
+        <w:tab/>
+        <w:t>11</w:t>
+      </w:r>
+    </w:p>
+    <w:p>
+      <w:pPr>
+        <w:tabs>
+          <w:tab w:pos="9072" w:val="right" w:leader="dot"/>
+        </w:tabs>
+        <w:spacing w:after="60"/>
+        <w:ind w:left="432"/>
+      </w:pPr>
+      <w:r>
+        <w:rPr>
+          <w:rFonts w:ascii="Arial" w:hAnsi="Arial"/>
+          <w:b w:val="0"/>
+          <w:color w:val="333333"/>
+          <w:sz w:val="21"/>
+        </w:rPr>
+        <w:t>Activity 4a — Telegram-Triggered AI Agent (Customer Service)</w:t>
+        <w:tab/>
+        <w:t>11</w:t>
+      </w:r>
+    </w:p>
+    <w:p>
+      <w:pPr>
+        <w:tabs>
+          <w:tab w:pos="9072" w:val="right" w:leader="dot"/>
+        </w:tabs>
+        <w:spacing w:after="60"/>
+        <w:ind w:left="432"/>
+      </w:pPr>
+      <w:r>
+        <w:rPr>
+          <w:rFonts w:ascii="Arial" w:hAnsi="Arial"/>
+          <w:b w:val="0"/>
+          <w:color w:val="333333"/>
+          <w:sz w:val="21"/>
+        </w:rPr>
+        <w:t>Activity 4b — Telegram Agent + Data Table Tool (HR Admin)</w:t>
+        <w:tab/>
+        <w:t>12</w:t>
+      </w:r>
+    </w:p>
+    <w:p>
+      <w:pPr>
+        <w:tabs>
+          <w:tab w:pos="9072" w:val="right" w:leader="dot"/>
+        </w:tabs>
+        <w:spacing w:after="60"/>
+      </w:pPr>
+      <w:r>
+        <w:rPr>
+          <w:rFonts w:ascii="Arial" w:hAnsi="Arial"/>
+          <w:b/>
+          <w:color w:val="333333"/>
+          <w:sz w:val="22"/>
+        </w:rPr>
+        <w:t>Topic 3: Webhooks</w:t>
+        <w:tab/>
+        <w:t>13</w:t>
+      </w:r>
+    </w:p>
+    <w:p>
+      <w:pPr>
+        <w:tabs>
+          <w:tab w:pos="9072" w:val="right" w:leader="dot"/>
+        </w:tabs>
+        <w:spacing w:after="60"/>
+        <w:ind w:left="432"/>
+      </w:pPr>
+      <w:r>
+        <w:rPr>
+          <w:rFonts w:ascii="Arial" w:hAnsi="Arial"/>
+          <w:b w:val="0"/>
+          <w:color w:val="333333"/>
+          <w:sz w:val="21"/>
+        </w:rPr>
+        <w:t>Activity 5 — Website Chatbot via Webhook (Investment Advisor)</w:t>
+        <w:tab/>
+        <w:t>13</w:t>
+      </w:r>
+    </w:p>
+    <w:p>
+      <w:pPr>
+        <w:tabs>
+          <w:tab w:pos="9072" w:val="right" w:leader="dot"/>
+        </w:tabs>
+        <w:spacing w:after="60"/>
+      </w:pPr>
+      <w:r>
+        <w:rPr>
+          <w:rFonts w:ascii="Arial" w:hAnsi="Arial"/>
+          <w:b/>
+          <w:color w:val="333333"/>
+          <w:sz w:val="22"/>
+        </w:rPr>
+        <w:t>Topic 4: APIs and HTTP Requests</w:t>
+        <w:tab/>
+        <w:t>15</w:t>
+      </w:r>
+    </w:p>
+    <w:p>
+      <w:pPr>
+        <w:tabs>
+          <w:tab w:pos="9072" w:val="right" w:leader="dot"/>
+        </w:tabs>
+        <w:spacing w:after="60"/>
+        <w:ind w:left="432"/>
+      </w:pPr>
+      <w:r>
+        <w:rPr>
+          <w:rFonts w:ascii="Arial" w:hAnsi="Arial"/>
+          <w:b w:val="0"/>
+          <w:color w:val="333333"/>
+          <w:sz w:val="21"/>
+        </w:rPr>
+        <w:t>Activity 6 — Finance API → Telegram (AI Day-Trading Agent)</w:t>
+        <w:tab/>
+        <w:t>15</w:t>
+      </w:r>
+    </w:p>
+    <w:p>
+      <w:pPr>
+        <w:tabs>
+          <w:tab w:pos="9072" w:val="right" w:leader="dot"/>
+        </w:tabs>
+        <w:spacing w:after="60"/>
+      </w:pPr>
+      <w:r>
+        <w:rPr>
+          <w:rFonts w:ascii="Arial" w:hAnsi="Arial"/>
+          <w:b/>
+          <w:color w:val="333333"/>
+          <w:sz w:val="22"/>
+        </w:rPr>
+        <w:t>Topic 5: Retrieval-Augmented Generation (RAG)</w:t>
+        <w:tab/>
+        <w:t>19</w:t>
+      </w:r>
+    </w:p>
+    <w:p>
+      <w:pPr>
+        <w:tabs>
+          <w:tab w:pos="9072" w:val="right" w:leader="dot"/>
+        </w:tabs>
+        <w:spacing w:after="60"/>
+        <w:ind w:left="432"/>
+      </w:pPr>
+      <w:r>
+        <w:rPr>
+          <w:rFonts w:ascii="Arial" w:hAnsi="Arial"/>
+          <w:b w:val="0"/>
+          <w:color w:val="333333"/>
+          <w:sz w:val="21"/>
+        </w:rPr>
+        <w:t>Activity 7a — RAG Chatbot: Upload a PDF, Ask in Telegram</w:t>
+        <w:tab/>
+        <w:t>20</w:t>
+      </w:r>
+    </w:p>
+    <w:p>
+      <w:pPr>
+        <w:tabs>
+          <w:tab w:pos="9072" w:val="right" w:leader="dot"/>
+        </w:tabs>
+        <w:spacing w:after="60"/>
+        <w:ind w:left="432"/>
+      </w:pPr>
+      <w:r>
+        <w:rPr>
+          <w:rFonts w:ascii="Arial" w:hAnsi="Arial"/>
+          <w:b w:val="0"/>
+          <w:color w:val="333333"/>
+          <w:sz w:val="21"/>
+        </w:rPr>
+        <w:t>Activity 7b — Customer-Support RAG Agent (Cook &amp; Bake Academy)</w:t>
+        <w:tab/>
+        <w:t>23</w:t>
+      </w:r>
+    </w:p>
+    <w:p>
+      <w:pPr>
+        <w:tabs>
+          <w:tab w:pos="9072" w:val="right" w:leader="dot"/>
+        </w:tabs>
+        <w:spacing w:after="60"/>
+      </w:pPr>
+      <w:r>
+        <w:rPr>
+          <w:rFonts w:ascii="Arial" w:hAnsi="Arial"/>
+          <w:b/>
+          <w:color w:val="333333"/>
+          <w:sz w:val="22"/>
+        </w:rPr>
+        <w:t>Topic 6: Security and Guardrails</w:t>
+        <w:tab/>
+        <w:t>28</w:t>
+      </w:r>
+    </w:p>
+    <w:p>
+      <w:pPr>
+        <w:tabs>
+          <w:tab w:pos="9072" w:val="right" w:leader="dot"/>
+        </w:tabs>
+        <w:spacing w:after="60"/>
+        <w:ind w:left="432"/>
+      </w:pPr>
+      <w:r>
+        <w:rPr>
+          <w:rFonts w:ascii="Arial" w:hAnsi="Arial"/>
+          <w:b w:val="0"/>
+          <w:color w:val="333333"/>
+          <w:sz w:val="21"/>
+        </w:rPr>
+        <w:t>Activity 8 — HR Service Portal</w:t>
+        <w:tab/>
+        <w:t>28</w:t>
+      </w:r>
+    </w:p>
+    <w:p>
+      <w:pPr>
+        <w:tabs>
+          <w:tab w:pos="9072" w:val="right" w:leader="dot"/>
+        </w:tabs>
+        <w:spacing w:after="60"/>
+        <w:ind w:left="432"/>
+      </w:pPr>
+      <w:r>
+        <w:rPr>
+          <w:rFonts w:ascii="Arial" w:hAnsi="Arial"/>
+          <w:b w:val="0"/>
+          <w:color w:val="333333"/>
+          <w:sz w:val="21"/>
+        </w:rPr>
+        <w:t>Activity 8a — Human-in-the-Loop Approval (Leave Application)</w:t>
+        <w:tab/>
+        <w:t>29</w:t>
+      </w:r>
+    </w:p>
+    <w:p>
+      <w:pPr>
+        <w:tabs>
+          <w:tab w:pos="9072" w:val="right" w:leader="dot"/>
+        </w:tabs>
+        <w:spacing w:after="60"/>
+        <w:ind w:left="432"/>
+      </w:pPr>
+      <w:r>
+        <w:rPr>
+          <w:rFonts w:ascii="Arial" w:hAnsi="Arial"/>
+          <w:b w:val="0"/>
+          <w:color w:val="333333"/>
+          <w:sz w:val="21"/>
+        </w:rPr>
+        <w:t>Activity 8b — HR Dashboard Data (Leave Balance &amp; History)</w:t>
+        <w:tab/>
+        <w:t>30</w:t>
+      </w:r>
+    </w:p>
+    <w:p>
+      <w:pPr>
+        <w:tabs>
+          <w:tab w:pos="9072" w:val="right" w:leader="dot"/>
+        </w:tabs>
+        <w:spacing w:after="60"/>
+        <w:ind w:left="432"/>
+      </w:pPr>
+      <w:r>
+        <w:rPr>
+          <w:rFonts w:ascii="Arial" w:hAnsi="Arial"/>
+          <w:b w:val="0"/>
+          <w:color w:val="333333"/>
+          <w:sz w:val="21"/>
+        </w:rPr>
+        <w:t>Activity 8c — AI Chatbot with Input &amp; Output Guardrails</w:t>
+        <w:tab/>
+        <w:t>31</w:t>
+      </w:r>
+    </w:p>
+    <w:p>
+      <w:pPr>
+        <w:tabs>
+          <w:tab w:pos="9072" w:val="right" w:leader="dot"/>
+        </w:tabs>
+        <w:spacing w:after="60"/>
+      </w:pPr>
+      <w:r>
+        <w:rPr>
+          <w:rFonts w:ascii="Arial" w:hAnsi="Arial"/>
+          <w:b/>
+          <w:color w:val="333333"/>
+          <w:sz w:val="22"/>
+        </w:rPr>
+        <w:t>Mini Capstone Project</w:t>
+        <w:tab/>
+        <w:t>33</w:t>
+      </w:r>
+    </w:p>
+    <w:p>
+      <w:pPr>
+        <w:tabs>
+          <w:tab w:pos="9072" w:val="right" w:leader="dot"/>
+        </w:tabs>
+        <w:spacing w:after="60"/>
+      </w:pPr>
+      <w:r>
+        <w:rPr>
+          <w:rFonts w:ascii="Arial" w:hAnsi="Arial"/>
+          <w:b/>
+          <w:color w:val="333333"/>
+          <w:sz w:val="22"/>
+        </w:rPr>
+        <w:t>Troubleshooting Cheat-Sheet</w:t>
+        <w:tab/>
+        <w:t>34</w:t>
+      </w:r>
+    </w:p>
+    <w:p>
+      <w:pPr>
+        <w:tabs>
+          <w:tab w:pos="9072" w:val="right" w:leader="dot"/>
+        </w:tabs>
+        <w:spacing w:after="60"/>
+      </w:pPr>
+      <w:r>
+        <w:rPr>
+          <w:rFonts w:ascii="Arial" w:hAnsi="Arial"/>
+          <w:b/>
+          <w:color w:val="333333"/>
+          <w:sz w:val="22"/>
+        </w:rPr>
+        <w:t>Glossary</w:t>
+        <w:tab/>
+        <w:t>34</w:t>
       </w:r>
     </w:p>
     <w:p>

</xml_diff>

<commit_message>
feat(rag7b): fix CX Agent + Pinecone flows (Gemini 3072-d, POST webhook, whole-brochure chunks); deck v43, LG v6.2
- Activity 7b flows updated from alfredang/n8n-ragdemo2: CX Agent webhook now POST + Respond to Webhook with a Pinecone retriever tool and Gemini chat model; Pinecone ingestion embeds with gemini-embedding-001 (3072-dim index) using one-brochure-one-chunk splitting
- Learner Guides (lab 7b + course LG v6.2) document the matching upload/retrieval namespace rule and the whole-brochure chunking rationale; new workflow screenshots
- Slide deck v43: 3-column n8n account login table (workspace URL / login / password) and updated Activity 7b slides
- Versioning rule (bump version + version-control record on every update) added to WSQ courseware skills
- Assessment folder excluded from the repo (confidential); Powered-by footer added to lab websites

Co-Authored-By: Claude Fable 5 <noreply@anthropic.com>
</commit_message>
<xml_diff>
--- a/courseware/LG-Agentic AI Automation with n8n.docx
+++ b/courseware/LG-Agentic AI Automation with n8n.docx
@@ -218,7 +218,7 @@
           <w:color w:val="1F6FEB"/>
           <w:sz w:val="24"/>
         </w:rPr>
-        <w:t>Version 6.1</w:t>
+        <w:t>Version 6.2</w:t>
       </w:r>
     </w:p>
     <w:p>
@@ -728,6 +728,64 @@
           </w:p>
         </w:tc>
       </w:tr>
+      <w:tr>
+        <w:tc>
+          <w:tcPr>
+            <w:tcW w:type="dxa" w:w="2160"/>
+          </w:tcPr>
+          <w:p>
+            <w:r/>
+            <w:r>
+              <w:rPr>
+                <w:sz w:val="19"/>
+              </w:rPr>
+              <w:t>6.2</w:t>
+            </w:r>
+          </w:p>
+        </w:tc>
+        <w:tc>
+          <w:tcPr>
+            <w:tcW w:type="dxa" w:w="2160"/>
+          </w:tcPr>
+          <w:p>
+            <w:r/>
+            <w:r>
+              <w:rPr>
+                <w:sz w:val="19"/>
+              </w:rPr>
+              <w:t>3 July 2026</w:t>
+            </w:r>
+          </w:p>
+        </w:tc>
+        <w:tc>
+          <w:tcPr>
+            <w:tcW w:type="dxa" w:w="2160"/>
+          </w:tcPr>
+          <w:p>
+            <w:r/>
+            <w:r>
+              <w:rPr>
+                <w:sz w:val="19"/>
+              </w:rPr>
+              <w:t>Updated Activity 7b to the fixed lab flows: Pinecone ingestion + CX Agent now use Google Gemini gemini-embedding-001 embeddings (3072-dim index) with whole-brochure chunks (one brochure = one vector); CX Agent webhook fixed to POST + Respond to Webhook with a Pinecone retriever tool and Gemini chat model; added the matching upload/retrieval namespace rule; new workflow screenshots</w:t>
+            </w:r>
+          </w:p>
+        </w:tc>
+        <w:tc>
+          <w:tcPr>
+            <w:tcW w:type="dxa" w:w="2160"/>
+          </w:tcPr>
+          <w:p>
+            <w:r/>
+            <w:r>
+              <w:rPr>
+                <w:sz w:val="19"/>
+              </w:rPr>
+              <w:t>Tertiary Infotech Academy Pte Ltd</w:t>
+            </w:r>
+          </w:p>
+        </w:tc>
+      </w:tr>
     </w:tbl>
     <w:p>
       <w:r>
@@ -748,473 +806,12 @@
       </w:r>
     </w:p>
     <w:p>
-      <w:pPr>
-        <w:tabs>
-          <w:tab w:pos="9072" w:val="right" w:leader="dot"/>
-        </w:tabs>
-        <w:spacing w:after="60"/>
-      </w:pPr>
-      <w:r>
-        <w:rPr>
-          <w:rFonts w:ascii="Arial" w:hAnsi="Arial"/>
-          <w:b/>
-          <w:color w:val="333333"/>
-          <w:sz w:val="22"/>
-        </w:rPr>
-        <w:t>0. Before You Start — Setup &amp; Prerequisites</w:t>
-        <w:tab/>
-        <w:t>5</w:t>
-      </w:r>
-    </w:p>
-    <w:p>
-      <w:pPr>
-        <w:tabs>
-          <w:tab w:pos="9072" w:val="right" w:leader="dot"/>
-        </w:tabs>
-        <w:spacing w:after="60"/>
-      </w:pPr>
-      <w:r>
-        <w:rPr>
-          <w:rFonts w:ascii="Arial" w:hAnsi="Arial"/>
-          <w:b/>
-          <w:color w:val="333333"/>
-          <w:sz w:val="22"/>
-        </w:rPr>
-        <w:t>Topic 1: Workflow Automation with n8n</w:t>
-        <w:tab/>
-        <w:t>7</w:t>
-      </w:r>
-    </w:p>
-    <w:p>
-      <w:pPr>
-        <w:tabs>
-          <w:tab w:pos="9072" w:val="right" w:leader="dot"/>
-        </w:tabs>
-        <w:spacing w:after="60"/>
-        <w:ind w:left="432"/>
-      </w:pPr>
-      <w:r>
-        <w:rPr>
-          <w:rFonts w:ascii="Arial" w:hAnsi="Arial"/>
-          <w:b w:val="0"/>
-          <w:color w:val="333333"/>
-          <w:sz w:val="21"/>
-        </w:rPr>
-        <w:t>Activity 1 — Flyer with QR Code (Form → Email)</w:t>
-        <w:tab/>
-        <w:t>7</w:t>
-      </w:r>
-    </w:p>
-    <w:p>
-      <w:pPr>
-        <w:tabs>
-          <w:tab w:pos="9072" w:val="right" w:leader="dot"/>
-        </w:tabs>
-        <w:spacing w:after="60"/>
-        <w:ind w:left="432"/>
-      </w:pPr>
-      <w:r>
-        <w:rPr>
-          <w:rFonts w:ascii="Arial" w:hAnsi="Arial"/>
-          <w:b w:val="0"/>
-          <w:color w:val="333333"/>
-          <w:sz w:val="21"/>
-        </w:rPr>
-        <w:t>Activity 2 — Capture Submissions in a Data Table</w:t>
-        <w:tab/>
-        <w:t>8</w:t>
-      </w:r>
-    </w:p>
-    <w:p>
-      <w:pPr>
-        <w:tabs>
-          <w:tab w:pos="9072" w:val="right" w:leader="dot"/>
-        </w:tabs>
-        <w:spacing w:after="60"/>
-        <w:ind w:left="432"/>
-      </w:pPr>
-      <w:r>
-        <w:rPr>
-          <w:rFonts w:ascii="Arial" w:hAnsi="Arial"/>
-          <w:b w:val="0"/>
-          <w:color w:val="333333"/>
-          <w:sz w:val="21"/>
-        </w:rPr>
-        <w:t>Activity 3a — Conditional Response (Data Table)</w:t>
-        <w:tab/>
-        <w:t>9</w:t>
-      </w:r>
-    </w:p>
-    <w:p>
-      <w:pPr>
-        <w:tabs>
-          <w:tab w:pos="9072" w:val="right" w:leader="dot"/>
-        </w:tabs>
-        <w:spacing w:after="60"/>
-        <w:ind w:left="432"/>
-      </w:pPr>
-      <w:r>
-        <w:rPr>
-          <w:rFonts w:ascii="Arial" w:hAnsi="Arial"/>
-          <w:b w:val="0"/>
-          <w:color w:val="333333"/>
-          <w:sz w:val="21"/>
-        </w:rPr>
-        <w:t>Activity 3b — Conditional Response (Google Sheets / Excel)</w:t>
-        <w:tab/>
-        <w:t>10</w:t>
-      </w:r>
-    </w:p>
-    <w:p>
-      <w:pPr>
-        <w:tabs>
-          <w:tab w:pos="9072" w:val="right" w:leader="dot"/>
-        </w:tabs>
-        <w:spacing w:after="60"/>
-      </w:pPr>
-      <w:r>
-        <w:rPr>
-          <w:rFonts w:ascii="Arial" w:hAnsi="Arial"/>
-          <w:b/>
-          <w:color w:val="333333"/>
-          <w:sz w:val="22"/>
-        </w:rPr>
-        <w:t>Topic 2: AI Agents</w:t>
-        <w:tab/>
-        <w:t>11</w:t>
-      </w:r>
-    </w:p>
-    <w:p>
-      <w:pPr>
-        <w:tabs>
-          <w:tab w:pos="9072" w:val="right" w:leader="dot"/>
-        </w:tabs>
-        <w:spacing w:after="60"/>
-        <w:ind w:left="432"/>
-      </w:pPr>
-      <w:r>
-        <w:rPr>
-          <w:rFonts w:ascii="Arial" w:hAnsi="Arial"/>
-          <w:b w:val="0"/>
-          <w:color w:val="333333"/>
-          <w:sz w:val="21"/>
-        </w:rPr>
-        <w:t>Activity 4a — Telegram-Triggered AI Agent (Customer Service)</w:t>
-        <w:tab/>
-        <w:t>11</w:t>
-      </w:r>
-    </w:p>
-    <w:p>
-      <w:pPr>
-        <w:tabs>
-          <w:tab w:pos="9072" w:val="right" w:leader="dot"/>
-        </w:tabs>
-        <w:spacing w:after="60"/>
-        <w:ind w:left="432"/>
-      </w:pPr>
-      <w:r>
-        <w:rPr>
-          <w:rFonts w:ascii="Arial" w:hAnsi="Arial"/>
-          <w:b w:val="0"/>
-          <w:color w:val="333333"/>
-          <w:sz w:val="21"/>
-        </w:rPr>
-        <w:t>Activity 4b — Telegram Agent + Data Table Tool (HR Admin)</w:t>
-        <w:tab/>
-        <w:t>12</w:t>
-      </w:r>
-    </w:p>
-    <w:p>
-      <w:pPr>
-        <w:tabs>
-          <w:tab w:pos="9072" w:val="right" w:leader="dot"/>
-        </w:tabs>
-        <w:spacing w:after="60"/>
-      </w:pPr>
-      <w:r>
-        <w:rPr>
-          <w:rFonts w:ascii="Arial" w:hAnsi="Arial"/>
-          <w:b/>
-          <w:color w:val="333333"/>
-          <w:sz w:val="22"/>
-        </w:rPr>
-        <w:t>Topic 3: Webhooks</w:t>
-        <w:tab/>
-        <w:t>13</w:t>
-      </w:r>
-    </w:p>
-    <w:p>
-      <w:pPr>
-        <w:tabs>
-          <w:tab w:pos="9072" w:val="right" w:leader="dot"/>
-        </w:tabs>
-        <w:spacing w:after="60"/>
-        <w:ind w:left="432"/>
-      </w:pPr>
-      <w:r>
-        <w:rPr>
-          <w:rFonts w:ascii="Arial" w:hAnsi="Arial"/>
-          <w:b w:val="0"/>
-          <w:color w:val="333333"/>
-          <w:sz w:val="21"/>
-        </w:rPr>
-        <w:t>Activity 5 — Website Chatbot via Webhook (Investment Advisor)</w:t>
-        <w:tab/>
-        <w:t>13</w:t>
-      </w:r>
-    </w:p>
-    <w:p>
-      <w:pPr>
-        <w:tabs>
-          <w:tab w:pos="9072" w:val="right" w:leader="dot"/>
-        </w:tabs>
-        <w:spacing w:after="60"/>
-      </w:pPr>
-      <w:r>
-        <w:rPr>
-          <w:rFonts w:ascii="Arial" w:hAnsi="Arial"/>
-          <w:b/>
-          <w:color w:val="333333"/>
-          <w:sz w:val="22"/>
-        </w:rPr>
-        <w:t>Topic 4: APIs and HTTP Requests</w:t>
-        <w:tab/>
-        <w:t>15</w:t>
-      </w:r>
-    </w:p>
-    <w:p>
-      <w:pPr>
-        <w:tabs>
-          <w:tab w:pos="9072" w:val="right" w:leader="dot"/>
-        </w:tabs>
-        <w:spacing w:after="60"/>
-        <w:ind w:left="432"/>
-      </w:pPr>
-      <w:r>
-        <w:rPr>
-          <w:rFonts w:ascii="Arial" w:hAnsi="Arial"/>
-          <w:b w:val="0"/>
-          <w:color w:val="333333"/>
-          <w:sz w:val="21"/>
-        </w:rPr>
-        <w:t>Activity 6 — Finance API → Telegram (AI Day-Trading Agent)</w:t>
-        <w:tab/>
-        <w:t>15</w:t>
-      </w:r>
-    </w:p>
-    <w:p>
-      <w:pPr>
-        <w:tabs>
-          <w:tab w:pos="9072" w:val="right" w:leader="dot"/>
-        </w:tabs>
-        <w:spacing w:after="60"/>
-      </w:pPr>
-      <w:r>
-        <w:rPr>
-          <w:rFonts w:ascii="Arial" w:hAnsi="Arial"/>
-          <w:b/>
-          <w:color w:val="333333"/>
-          <w:sz w:val="22"/>
-        </w:rPr>
-        <w:t>Topic 5: Retrieval-Augmented Generation (RAG)</w:t>
-        <w:tab/>
-        <w:t>19</w:t>
-      </w:r>
-    </w:p>
-    <w:p>
-      <w:pPr>
-        <w:tabs>
-          <w:tab w:pos="9072" w:val="right" w:leader="dot"/>
-        </w:tabs>
-        <w:spacing w:after="60"/>
-        <w:ind w:left="432"/>
-      </w:pPr>
-      <w:r>
-        <w:rPr>
-          <w:rFonts w:ascii="Arial" w:hAnsi="Arial"/>
-          <w:b w:val="0"/>
-          <w:color w:val="333333"/>
-          <w:sz w:val="21"/>
-        </w:rPr>
-        <w:t>Activity 7a — RAG Chatbot: Upload a PDF, Ask in Telegram</w:t>
-        <w:tab/>
-        <w:t>20</w:t>
-      </w:r>
-    </w:p>
-    <w:p>
-      <w:pPr>
-        <w:tabs>
-          <w:tab w:pos="9072" w:val="right" w:leader="dot"/>
-        </w:tabs>
-        <w:spacing w:after="60"/>
-        <w:ind w:left="432"/>
-      </w:pPr>
-      <w:r>
-        <w:rPr>
-          <w:rFonts w:ascii="Arial" w:hAnsi="Arial"/>
-          <w:b w:val="0"/>
-          <w:color w:val="333333"/>
-          <w:sz w:val="21"/>
-        </w:rPr>
-        <w:t>Activity 7b — Customer-Support RAG Agent (Cook &amp; Bake Academy)</w:t>
-        <w:tab/>
-        <w:t>23</w:t>
-      </w:r>
-    </w:p>
-    <w:p>
-      <w:pPr>
-        <w:tabs>
-          <w:tab w:pos="9072" w:val="right" w:leader="dot"/>
-        </w:tabs>
-        <w:spacing w:after="60"/>
-      </w:pPr>
-      <w:r>
-        <w:rPr>
-          <w:rFonts w:ascii="Arial" w:hAnsi="Arial"/>
-          <w:b/>
-          <w:color w:val="333333"/>
-          <w:sz w:val="22"/>
-        </w:rPr>
-        <w:t>Topic 6: Security and Guardrails</w:t>
-        <w:tab/>
-        <w:t>28</w:t>
-      </w:r>
-    </w:p>
-    <w:p>
-      <w:pPr>
-        <w:tabs>
-          <w:tab w:pos="9072" w:val="right" w:leader="dot"/>
-        </w:tabs>
-        <w:spacing w:after="60"/>
-        <w:ind w:left="432"/>
-      </w:pPr>
-      <w:r>
-        <w:rPr>
-          <w:rFonts w:ascii="Arial" w:hAnsi="Arial"/>
-          <w:b w:val="0"/>
-          <w:color w:val="333333"/>
-          <w:sz w:val="21"/>
-        </w:rPr>
-        <w:t>Activity 8 — HR Service Portal</w:t>
-        <w:tab/>
-        <w:t>28</w:t>
-      </w:r>
-    </w:p>
-    <w:p>
-      <w:pPr>
-        <w:tabs>
-          <w:tab w:pos="9072" w:val="right" w:leader="dot"/>
-        </w:tabs>
-        <w:spacing w:after="60"/>
-        <w:ind w:left="432"/>
-      </w:pPr>
-      <w:r>
-        <w:rPr>
-          <w:rFonts w:ascii="Arial" w:hAnsi="Arial"/>
-          <w:b w:val="0"/>
-          <w:color w:val="333333"/>
-          <w:sz w:val="21"/>
-        </w:rPr>
-        <w:t>Activity 8a — Human-in-the-Loop Approval (Leave Application)</w:t>
-        <w:tab/>
-        <w:t>29</w:t>
-      </w:r>
-    </w:p>
-    <w:p>
-      <w:pPr>
-        <w:tabs>
-          <w:tab w:pos="9072" w:val="right" w:leader="dot"/>
-        </w:tabs>
-        <w:spacing w:after="60"/>
-        <w:ind w:left="432"/>
-      </w:pPr>
-      <w:r>
-        <w:rPr>
-          <w:rFonts w:ascii="Arial" w:hAnsi="Arial"/>
-          <w:b w:val="0"/>
-          <w:color w:val="333333"/>
-          <w:sz w:val="21"/>
-        </w:rPr>
-        <w:t>Activity 8b — HR Dashboard Data (Leave Balance &amp; History)</w:t>
-        <w:tab/>
-        <w:t>30</w:t>
-      </w:r>
-    </w:p>
-    <w:p>
-      <w:pPr>
-        <w:tabs>
-          <w:tab w:pos="9072" w:val="right" w:leader="dot"/>
-        </w:tabs>
-        <w:spacing w:after="60"/>
-        <w:ind w:left="432"/>
-      </w:pPr>
-      <w:r>
-        <w:rPr>
-          <w:rFonts w:ascii="Arial" w:hAnsi="Arial"/>
-          <w:b w:val="0"/>
-          <w:color w:val="333333"/>
-          <w:sz w:val="21"/>
-        </w:rPr>
-        <w:t>Activity 8c — AI Chatbot with Input &amp; Output Guardrails</w:t>
-        <w:tab/>
-        <w:t>31</w:t>
-      </w:r>
-    </w:p>
-    <w:p>
-      <w:pPr>
-        <w:tabs>
-          <w:tab w:pos="9072" w:val="right" w:leader="dot"/>
-        </w:tabs>
-        <w:spacing w:after="60"/>
-      </w:pPr>
-      <w:r>
-        <w:rPr>
-          <w:rFonts w:ascii="Arial" w:hAnsi="Arial"/>
-          <w:b/>
-          <w:color w:val="333333"/>
-          <w:sz w:val="22"/>
-        </w:rPr>
-        <w:t>Mini Capstone Project</w:t>
-        <w:tab/>
-        <w:t>33</w:t>
-      </w:r>
-    </w:p>
-    <w:p>
-      <w:pPr>
-        <w:tabs>
-          <w:tab w:pos="9072" w:val="right" w:leader="dot"/>
-        </w:tabs>
-        <w:spacing w:after="60"/>
-      </w:pPr>
-      <w:r>
-        <w:rPr>
-          <w:rFonts w:ascii="Arial" w:hAnsi="Arial"/>
-          <w:b/>
-          <w:color w:val="333333"/>
-          <w:sz w:val="22"/>
-        </w:rPr>
-        <w:t>Troubleshooting Cheat-Sheet</w:t>
-        <w:tab/>
-        <w:t>34</w:t>
-      </w:r>
-    </w:p>
-    <w:p>
-      <w:pPr>
-        <w:tabs>
-          <w:tab w:pos="9072" w:val="right" w:leader="dot"/>
-        </w:tabs>
-        <w:spacing w:after="60"/>
-      </w:pPr>
-      <w:r>
-        <w:rPr>
-          <w:rFonts w:ascii="Arial" w:hAnsi="Arial"/>
-          <w:b/>
-          <w:color w:val="333333"/>
-          <w:sz w:val="22"/>
-        </w:rPr>
-        <w:t>Glossary</w:t>
-        <w:tab/>
-        <w:t>34</w:t>
+      <w:r>
+        <w:fldChar w:fldCharType="begin"/>
+        <w:instrText xml:space="preserve">TOC \o "1-2" \h \z \u</w:instrText>
+        <w:fldChar w:fldCharType="separate"/>
+        <w:t>Right-click and choose “Update Field”, or press F9, to build the table of contents.</w:t>
+        <w:fldChar w:fldCharType="end"/>
       </w:r>
     </w:p>
     <w:p>
@@ -6805,7 +6402,7 @@
       <w:r>
         <w:drawing>
           <wp:inline xmlns:a="http://schemas.openxmlformats.org/drawingml/2006/main" xmlns:pic="http://schemas.openxmlformats.org/drawingml/2006/picture">
-            <wp:extent cx="5669280" cy="3297631"/>
+            <wp:extent cx="5669280" cy="3188970"/>
             <wp:docPr id="18" name="Picture 18"/>
             <wp:cNvGraphicFramePr>
               <a:graphicFrameLocks noChangeAspect="1"/>
@@ -6826,7 +6423,7 @@
                   <pic:spPr>
                     <a:xfrm>
                       <a:off x="0" y="0"/>
-                      <a:ext cx="5669280" cy="3297631"/>
+                      <a:ext cx="5669280" cy="3188970"/>
                     </a:xfrm>
                     <a:prstGeom prst="rect"/>
                   </pic:spPr>
@@ -6847,7 +6444,7 @@
           <w:color w:val="555B66"/>
           <w:sz w:val="18"/>
         </w:rPr>
-        <w:t>Activity 7b CX Agent — website webhook → retrieve from the vector store → respond to the chat widget</w:t>
+        <w:t>Activity 7b CX Agent — website webhook (POST) → AI Agent with a Pinecone retriever tool + Gemini chat model → respond to the chat widget</w:t>
       </w:r>
     </w:p>
     <w:p>
@@ -6938,15 +6535,60 @@
         <w:t xml:space="preserve">Note:  </w:t>
       </w:r>
       <w:r>
-        <w:t xml:space="preserve">All three stores use OpenAI </w:t>
+        <w:t xml:space="preserve">The </w:t>
       </w:r>
       <w:r>
         <w:rPr>
           <w:b/>
         </w:rPr>
+        <w:t>Supabase</w:t>
+      </w:r>
+      <w:r>
+        <w:t xml:space="preserve"> and </w:t>
+      </w:r>
+      <w:r>
+        <w:rPr>
+          <w:b/>
+        </w:rPr>
+        <w:t>Qdrant</w:t>
+      </w:r>
+      <w:r>
+        <w:t xml:space="preserve"> flows embed with OpenAI </w:t>
+      </w:r>
+      <w:r>
+        <w:rPr>
+          <w:b/>
+        </w:rPr>
         <w:t>`text-embedding-3-small` (1536 dimensions)</w:t>
       </w:r>
       <w:r>
+        <w:t xml:space="preserve">; the </w:t>
+      </w:r>
+      <w:r>
+        <w:rPr>
+          <w:b/>
+        </w:rPr>
+        <w:t>Pinecone</w:t>
+      </w:r>
+      <w:r>
+        <w:t xml:space="preserve"> flow and the </w:t>
+      </w:r>
+      <w:r>
+        <w:rPr>
+          <w:b/>
+        </w:rPr>
+        <w:t>CX Agent</w:t>
+      </w:r>
+      <w:r>
+        <w:t xml:space="preserve"> embed with Google Gemini </w:t>
+      </w:r>
+      <w:r>
+        <w:rPr>
+          <w:b/>
+        </w:rPr>
+        <w:t>`gemini-embedding-001` (3072 dimensions)</w:t>
+      </w:r>
+      <w:r>
         <w:t xml:space="preserve">. The table/index/collection dimension </w:t>
       </w:r>
       <w:r>
@@ -6956,7 +6598,7 @@
         <w:t>must</w:t>
       </w:r>
       <w:r>
-        <w:t xml:space="preserve"> equal 1536 or inserts will fail. Change the embedding model and the dimension changes too.</w:t>
+        <w:t xml:space="preserve"> equal the embedding model's dimension or inserts will fail.</w:t>
       </w:r>
     </w:p>
     <w:p>
@@ -7095,7 +6737,7 @@
         <w:rPr>
           <w:b/>
         </w:rPr>
-        <w:t>Manual Trigger → List Drive folder → Download each brochure → Recursive Character Text Splitter → Embeddings (OpenAI) → Vector Store (Insert)</w:t>
+        <w:t>Manual Trigger → List Drive folder → Download each brochure → Text Splitter → Embeddings → Vector Store (Insert)</w:t>
       </w:r>
       <w:r>
         <w:t xml:space="preserve"> — only the final </w:t>
@@ -7107,7 +6749,7 @@
         <w:t>Vector Store</w:t>
       </w:r>
       <w:r>
-        <w:t xml:space="preserve"> node changes.</w:t>
+        <w:t xml:space="preserve"> node (and its matching embedding model) changes.</w:t>
       </w:r>
     </w:p>
     <w:p>
@@ -7334,82 +6976,161 @@
         <w:rPr>
           <w:b/>
         </w:rPr>
-        <w:t>Dimensions = 1536</w:t>
-      </w:r>
-      <w:r>
-        <w:t xml:space="preserve">, </w:t>
-      </w:r>
-      <w:r>
-        <w:rPr>
-          <w:b/>
-        </w:rPr>
-        <w:t>Metric = cosine</w:t>
-      </w:r>
-      <w:r>
-        <w:t xml:space="preserve"> (serverless region).</w:t>
-      </w:r>
-    </w:p>
-    <w:p>
-      <w:pPr>
-        <w:pStyle w:val="ListNumber"/>
-      </w:pPr>
-      <w:r>
-        <w:t xml:space="preserve">Copy your </w:t>
-      </w:r>
-      <w:r>
-        <w:rPr>
-          <w:b/>
-        </w:rPr>
-        <w:t>API key</w:t>
-      </w:r>
-      <w:r>
-        <w:t xml:space="preserve"> (API Keys), then add a </w:t>
-      </w:r>
-      <w:r>
-        <w:rPr>
-          <w:b/>
-        </w:rPr>
-        <w:t>Pinecone API</w:t>
-      </w:r>
-      <w:r>
-        <w:t xml:space="preserve"> credential in n8n.</w:t>
-      </w:r>
-    </w:p>
-    <w:p>
-      <w:pPr>
-        <w:pStyle w:val="ListNumber"/>
-      </w:pPr>
-      <w:r>
-        <w:t xml:space="preserve">Import </w:t>
+        <w:t>Dimensions = 3072</w:t>
+      </w:r>
+      <w:r>
+        <w:t xml:space="preserve"> (Gemini </w:t>
       </w:r>
       <w:r>
         <w:rPr>
           <w:rFonts w:ascii="Consolas" w:hAnsi="Consolas"/>
           <w:color w:val="C7254E"/>
         </w:rPr>
-        <w:t>Activity7b-Pinecone-Upload.json</w:t>
-      </w:r>
-      <w:r>
-        <w:t xml:space="preserve">; in the Pinecone Vector Store node select the </w:t>
+        <w:t>gemini-embedding-001</w:t>
+      </w:r>
+      <w:r>
+        <w:t xml:space="preserve">), </w:t>
+      </w:r>
+      <w:r>
+        <w:rPr>
+          <w:b/>
+        </w:rPr>
+        <w:t>Metric = cosine</w:t>
+      </w:r>
+      <w:r>
+        <w:t xml:space="preserve"> (serverless region).</w:t>
+      </w:r>
+    </w:p>
+    <w:p>
+      <w:pPr>
+        <w:pStyle w:val="ListNumber"/>
+      </w:pPr>
+      <w:r>
+        <w:t xml:space="preserve">Copy your </w:t>
+      </w:r>
+      <w:r>
+        <w:rPr>
+          <w:b/>
+        </w:rPr>
+        <w:t>API key</w:t>
+      </w:r>
+      <w:r>
+        <w:t xml:space="preserve"> (API Keys), then add </w:t>
+      </w:r>
+      <w:r>
+        <w:rPr>
+          <w:b/>
+        </w:rPr>
+        <w:t>Pinecone API</w:t>
+      </w:r>
+      <w:r>
+        <w:t xml:space="preserve"> and </w:t>
+      </w:r>
+      <w:r>
+        <w:rPr>
+          <w:b/>
+        </w:rPr>
+        <w:t>Google Gemini</w:t>
+      </w:r>
+      <w:r>
+        <w:t xml:space="preserve"> credentials in n8n.</w:t>
+      </w:r>
+    </w:p>
+    <w:p>
+      <w:pPr>
+        <w:pStyle w:val="ListNumber"/>
+      </w:pPr>
+      <w:r>
+        <w:t xml:space="preserve">Import </w:t>
       </w:r>
       <w:r>
         <w:rPr>
           <w:rFonts w:ascii="Consolas" w:hAnsi="Consolas"/>
           <w:color w:val="C7254E"/>
         </w:rPr>
+        <w:t>Activity7b-Pinecone-Upload.json</w:t>
+      </w:r>
+      <w:r>
+        <w:t xml:space="preserve">; in the Pinecone Vector Store node select the </w:t>
+      </w:r>
+      <w:r>
+        <w:rPr>
+          <w:rFonts w:ascii="Consolas" w:hAnsi="Consolas"/>
+          <w:color w:val="C7254E"/>
+        </w:rPr>
         <w:t>course-brochures</w:t>
       </w:r>
       <w:r>
-        <w:t xml:space="preserve"> index (brochures are stored under namespace </w:t>
-      </w:r>
+        <w:t xml:space="preserve"> index.</w:t>
+      </w:r>
+    </w:p>
+    <w:p>
+      <w:pPr>
+        <w:shd w:val="clear" w:color="auto" w:fill="FFF4E5"/>
+      </w:pPr>
       <w:r>
         <w:rPr>
           <w:b/>
-        </w:rPr>
-        <w:t>`brochures`</w:t>
-      </w:r>
-      <w:r>
-        <w:t>).</w:t>
+          <w:color w:val="B56A00"/>
+        </w:rPr>
+        <w:t xml:space="preserve">Note:  </w:t>
+      </w:r>
+      <w:r>
+        <w:rPr>
+          <w:b/>
+        </w:rPr>
+        <w:t>Namespace rule:</w:t>
+      </w:r>
+      <w:r>
+        <w:t xml:space="preserve"> the upload flow and the CX Agent's retriever must use the </w:t>
+      </w:r>
+      <w:r>
+        <w:rPr>
+          <w:b/>
+        </w:rPr>
+        <w:t>same namespace</w:t>
+      </w:r>
+      <w:r>
+        <w:t xml:space="preserve"> — both are left on the </w:t>
+      </w:r>
+      <w:r>
+        <w:rPr>
+          <w:b/>
+        </w:rPr>
+        <w:t>default namespace</w:t>
+      </w:r>
+      <w:r>
+        <w:t>. If you set a namespace on one side, set the identical value on the other, or the agent searches an empty namespace and returns nothing.</w:t>
+      </w:r>
+    </w:p>
+    <w:p>
+      <w:pPr>
+        <w:shd w:val="clear" w:color="auto" w:fill="FFF4E5"/>
+      </w:pPr>
+      <w:r>
+        <w:rPr>
+          <w:b/>
+          <w:color w:val="B56A00"/>
+        </w:rPr>
+        <w:t xml:space="preserve">Note:  </w:t>
+      </w:r>
+      <w:r>
+        <w:rPr>
+          <w:b/>
+        </w:rPr>
+        <w:t>One brochure = one chunk:</w:t>
+      </w:r>
+      <w:r>
+        <w:t xml:space="preserve"> the 20 brochures are very similar, so small chunks make retrieval mix up courses. The </w:t>
+      </w:r>
+      <w:r>
+        <w:rPr>
+          <w:b/>
+        </w:rPr>
+        <w:t>Whole-Brochure Splitter</w:t>
+      </w:r>
+      <w:r>
+        <w:t xml:space="preserve"> (chunk size 4000, overlap 0) keeps each brochure as a single vector, so the agent always retrieves complete brochures and never confuses one course's fees with another's.</w:t>
       </w:r>
     </w:p>
     <w:p>
@@ -7419,7 +7140,7 @@
       <w:r>
         <w:drawing>
           <wp:inline xmlns:a="http://schemas.openxmlformats.org/drawingml/2006/main" xmlns:pic="http://schemas.openxmlformats.org/drawingml/2006/picture">
-            <wp:extent cx="5669280" cy="3297631"/>
+            <wp:extent cx="5669280" cy="3188970"/>
             <wp:docPr id="20" name="Picture 20"/>
             <wp:cNvGraphicFramePr>
               <a:graphicFrameLocks noChangeAspect="1"/>
@@ -7440,7 +7161,7 @@
                   <pic:spPr>
                     <a:xfrm>
                       <a:off x="0" y="0"/>
-                      <a:ext cx="5669280" cy="3297631"/>
+                      <a:ext cx="5669280" cy="3188970"/>
                     </a:xfrm>
                     <a:prstGeom prst="rect"/>
                   </pic:spPr>
@@ -7461,7 +7182,7 @@
           <w:color w:val="555B66"/>
           <w:sz w:val="18"/>
         </w:rPr>
-        <w:t>Pinecone ingestion — same flow, ending at a Pinecone Vector Store (Insert) node</w:t>
+        <w:t>Pinecone ingestion — whole-brochure chunks embedded with Gemini (3072-d) into a Pinecone Vector Store (Insert) node</w:t>
       </w:r>
     </w:p>
     <w:p>
@@ -7667,10 +7388,10 @@
         <w:rPr>
           <w:b/>
         </w:rPr>
-        <w:t>OpenAI</w:t>
-      </w:r>
-      <w:r>
-        <w:t xml:space="preserve"> and </w:t>
+        <w:t>embeddings</w:t>
+      </w:r>
+      <w:r>
+        <w:t xml:space="preserve"> (OpenAI or Gemini) and </w:t>
       </w:r>
       <w:r>
         <w:rPr>
@@ -7696,13 +7417,22 @@
         <w:t>Execute workflow</w:t>
       </w:r>
       <w:r>
-        <w:t>. It lists, downloads, splits, embeds and upserts ~</w:t>
+        <w:t>. Supabase/Qdrant upsert ~</w:t>
       </w:r>
       <w:r>
         <w:rPr>
           <w:b/>
         </w:rPr>
-        <w:t>30–60 vectors</w:t>
+        <w:t>30–60 chunks</w:t>
+      </w:r>
+      <w:r>
+        <w:t xml:space="preserve">; Pinecone keeps one brochure per chunk, so expect exactly </w:t>
+      </w:r>
+      <w:r>
+        <w:rPr>
+          <w:b/>
+        </w:rPr>
+        <w:t>20 vectors</w:t>
       </w:r>
       <w:r>
         <w:t>. Verify the rows/points appear in your DB.</w:t>
@@ -7734,7 +7464,7 @@
         <w:t>`Activity7b-CX-Agent.json`</w:t>
       </w:r>
       <w:r>
-        <w:t xml:space="preserve"> (the answering workflow: Webhook → AI Agent + retriever → Respond to Webhook).</w:t>
+        <w:t xml:space="preserve"> (the answering workflow: Webhook (POST) → AI Agent with a Pinecone retriever tool + Google Gemini chat model → Respond to Webhook).</w:t>
       </w:r>
     </w:p>
     <w:p>
@@ -7748,10 +7478,10 @@
         <w:rPr>
           <w:b/>
         </w:rPr>
-        <w:t>retriever</w:t>
-      </w:r>
-      <w:r>
-        <w:t xml:space="preserve"> vector-store node at the </w:t>
+        <w:t>Pinecone retriever tool</w:t>
+      </w:r>
+      <w:r>
+        <w:t xml:space="preserve"> at the </w:t>
       </w:r>
       <w:r>
         <w:rPr>
@@ -7760,7 +7490,26 @@
         <w:t>same</w:t>
       </w:r>
       <w:r>
-        <w:t xml:space="preserve"> store/index/collection you ingested into (same 1536-dim embeddings); add your OpenAI + DB credentials.</w:t>
+        <w:t xml:space="preserve"> </w:t>
+      </w:r>
+      <w:r>
+        <w:rPr>
+          <w:rFonts w:ascii="Consolas" w:hAnsi="Consolas"/>
+          <w:color w:val="C7254E"/>
+        </w:rPr>
+        <w:t>course-brochures</w:t>
+      </w:r>
+      <w:r>
+        <w:t xml:space="preserve"> index you ingested into — same Gemini embeddings (3072-dim) and same (default) </w:t>
+      </w:r>
+      <w:r>
+        <w:rPr>
+          <w:b/>
+        </w:rPr>
+        <w:t>namespace</w:t>
+      </w:r>
+      <w:r>
+        <w:t>; add your Pinecone + Google Gemini credentials.</w:t>
       </w:r>
     </w:p>
     <w:p>

</xml_diff>

<commit_message>
refactor(courseware): deck v44 (cover version line, no overlap); move assets+build into .claude/skills; LG v6.3
- Cover page: version number shown under the UEN line; removed overlapping version/copyright text boxes
- courseware/assets → .claude/skills/tertiary-course-slides/assets; courseware/build → .claude/skills/courseware-build; all generator/skill references updated
- LG v6.3: image links updated for the new asset location (version-control record entry added)
- Old versioned outputs (v42/v43) removed per the every-update-bumps-version rule

Co-Authored-By: Claude Fable 5 <noreply@anthropic.com>
</commit_message>
<xml_diff>
--- a/courseware/LG-Agentic AI Automation with n8n.docx
+++ b/courseware/LG-Agentic AI Automation with n8n.docx
@@ -218,7 +218,7 @@
           <w:color w:val="1F6FEB"/>
           <w:sz w:val="24"/>
         </w:rPr>
-        <w:t>Version 6.2</w:t>
+        <w:t>Version 6.3</w:t>
       </w:r>
     </w:p>
     <w:p>
@@ -768,6 +768,64 @@
                 <w:sz w:val="19"/>
               </w:rPr>
               <w:t>Updated Activity 7b to the fixed lab flows: Pinecone ingestion + CX Agent now use Google Gemini gemini-embedding-001 embeddings (3072-dim index) with whole-brochure chunks (one brochure = one vector); CX Agent webhook fixed to POST + Respond to Webhook with a Pinecone retriever tool and Gemini chat model; added the matching upload/retrieval namespace rule; new workflow screenshots</w:t>
+            </w:r>
+          </w:p>
+        </w:tc>
+        <w:tc>
+          <w:tcPr>
+            <w:tcW w:type="dxa" w:w="2160"/>
+          </w:tcPr>
+          <w:p>
+            <w:r/>
+            <w:r>
+              <w:rPr>
+                <w:sz w:val="19"/>
+              </w:rPr>
+              <w:t>Tertiary Infotech Academy Pte Ltd</w:t>
+            </w:r>
+          </w:p>
+        </w:tc>
+      </w:tr>
+      <w:tr>
+        <w:tc>
+          <w:tcPr>
+            <w:tcW w:type="dxa" w:w="2160"/>
+          </w:tcPr>
+          <w:p>
+            <w:r/>
+            <w:r>
+              <w:rPr>
+                <w:sz w:val="19"/>
+              </w:rPr>
+              <w:t>6.3</w:t>
+            </w:r>
+          </w:p>
+        </w:tc>
+        <w:tc>
+          <w:tcPr>
+            <w:tcW w:type="dxa" w:w="2160"/>
+          </w:tcPr>
+          <w:p>
+            <w:r/>
+            <w:r>
+              <w:rPr>
+                <w:sz w:val="19"/>
+              </w:rPr>
+              <w:t>3 July 2026</w:t>
+            </w:r>
+          </w:p>
+        </w:tc>
+        <w:tc>
+          <w:tcPr>
+            <w:tcW w:type="dxa" w:w="2160"/>
+          </w:tcPr>
+          <w:p>
+            <w:r/>
+            <w:r>
+              <w:rPr>
+                <w:sz w:val="19"/>
+              </w:rPr>
+              <w:t>Relocated courseware assets and build scripts into the .claude/skills folder; updated embedded image links accordingly (no content changes)</w:t>
             </w:r>
           </w:p>
         </w:tc>

</xml_diff>